<commit_message>
Edits and push of .md for Kat
</commit_message>
<xml_diff>
--- a/Group Meeting Report iteration 2.docx
+++ b/Group Meeting Report iteration 2.docx
@@ -375,7 +375,6 @@
                 <w:showingPlcHdr/>
                 <w15:appearance w15:val="hidden"/>
               </w:sdtPr>
-              <w:sdtEndPr/>
               <w:sdtContent>
                 <w:r>
                   <w:rPr>
@@ -432,7 +431,6 @@
                 <w:showingPlcHdr/>
                 <w15:appearance w15:val="hidden"/>
               </w:sdtPr>
-              <w:sdtEndPr/>
               <w:sdtContent>
                 <w:r>
                   <w:rPr>
@@ -455,11 +453,19 @@
             <w:pPr>
               <w:spacing w:before="60" w:after="60" w:line="276" w:lineRule="auto"/>
             </w:pPr>
+            <w:proofErr w:type="spellStart"/>
             <w:r>
               <w:rPr>
                 <w:rFonts w:cstheme="minorBidi"/>
               </w:rPr>
-              <w:t>Eef, Kat, Tyler</w:t>
+              <w:t>Eef</w:t>
+            </w:r>
+            <w:proofErr w:type="spellEnd"/>
+            <w:r>
+              <w:rPr>
+                <w:rFonts w:cstheme="minorBidi"/>
+              </w:rPr>
+              <w:t>, Kat, Tyler</w:t>
             </w:r>
           </w:p>
         </w:tc>
@@ -541,7 +547,6 @@
                 <w:showingPlcHdr/>
                 <w15:appearance w15:val="hidden"/>
               </w:sdtPr>
-              <w:sdtEndPr/>
               <w:sdtContent>
                 <w:r>
                   <w:rPr>
@@ -644,7 +649,6 @@
         <w:showingPlcHdr/>
         <w15:appearance w15:val="hidden"/>
       </w:sdtPr>
-      <w:sdtEndPr/>
       <w:sdtContent>
         <w:p>
           <w:pPr>
@@ -759,7 +763,6 @@
                 <w:showingPlcHdr/>
                 <w15:appearance w15:val="hidden"/>
               </w:sdtPr>
-              <w:sdtEndPr/>
               <w:sdtContent>
                 <w:r>
                   <w:rPr>
@@ -811,7 +814,6 @@
           <w:showingPlcHdr/>
           <w15:appearance w15:val="hidden"/>
         </w:sdtPr>
-        <w:sdtEndPr/>
         <w:sdtContent>
           <w:r>
             <w:rPr>
@@ -834,7 +836,6 @@
         <w:temporary/>
         <w15:appearance w15:val="hidden"/>
       </w:sdtPr>
-      <w:sdtEndPr/>
       <w:sdtContent>
         <w:p>
           <w:pPr>
@@ -847,7 +848,23 @@
               <w:rFonts w:ascii="Arial" w:eastAsia="Arial" w:hAnsi="Arial" w:cs="Arial"/>
               <w:color w:val="000000" w:themeColor="text1"/>
             </w:rPr>
-            <w:t>We have now submitted iteration 1 of our project, and we are preparing to start on the second iteration, and so we spent part of this meeting time discussing ideas and trading feeback for how we will be going about iteration 2</w:t>
+            <w:t xml:space="preserve">We have now submitted iteration 1 of our project, and we are preparing to start on the second iteration, and so we spent part of this meeting time discussing ideas and trading </w:t>
+          </w:r>
+          <w:proofErr w:type="spellStart"/>
+          <w:r>
+            <w:rPr>
+              <w:rFonts w:ascii="Arial" w:eastAsia="Arial" w:hAnsi="Arial" w:cs="Arial"/>
+              <w:color w:val="000000" w:themeColor="text1"/>
+            </w:rPr>
+            <w:t>feeback</w:t>
+          </w:r>
+          <w:proofErr w:type="spellEnd"/>
+          <w:r>
+            <w:rPr>
+              <w:rFonts w:ascii="Arial" w:eastAsia="Arial" w:hAnsi="Arial" w:cs="Arial"/>
+              <w:color w:val="000000" w:themeColor="text1"/>
+            </w:rPr>
+            <w:t xml:space="preserve"> for how we will be going about iteration 2</w:t>
           </w:r>
         </w:p>
       </w:sdtContent>
@@ -872,7 +889,6 @@
           <w:showingPlcHdr/>
           <w15:appearance w15:val="hidden"/>
         </w:sdtPr>
-        <w:sdtEndPr/>
         <w:sdtContent>
           <w:r>
             <w:rPr>
@@ -896,7 +912,6 @@
         <w:showingPlcHdr/>
         <w15:appearance w15:val="hidden"/>
       </w:sdtPr>
-      <w:sdtEndPr/>
       <w:sdtContent>
         <w:p>
           <w:pPr>
@@ -971,7 +986,6 @@
                 <w:showingPlcHdr/>
                 <w15:appearance w15:val="hidden"/>
               </w:sdtPr>
-              <w:sdtEndPr/>
               <w:sdtContent>
                 <w:r>
                   <w:rPr>
@@ -1011,7 +1025,6 @@
                 <w:showingPlcHdr/>
                 <w15:appearance w15:val="hidden"/>
               </w:sdtPr>
-              <w:sdtEndPr/>
               <w:sdtContent>
                 <w:r>
                   <w:rPr>
@@ -1051,7 +1064,6 @@
                 <w:showingPlcHdr/>
                 <w15:appearance w15:val="hidden"/>
               </w:sdtPr>
-              <w:sdtEndPr/>
               <w:sdtContent>
                 <w:r>
                   <w:rPr>
@@ -1729,8 +1741,16 @@
               <w:rPr>
                 <w:rFonts w:ascii="Arial" w:eastAsia="Arial" w:hAnsi="Arial" w:cs="Arial"/>
               </w:rPr>
-              <w:t>Kat, Tyler, Eef</w:t>
-            </w:r>
+              <w:t xml:space="preserve">Kat, Tyler, </w:t>
+            </w:r>
+            <w:proofErr w:type="spellStart"/>
+            <w:r>
+              <w:rPr>
+                <w:rFonts w:ascii="Arial" w:eastAsia="Arial" w:hAnsi="Arial" w:cs="Arial"/>
+              </w:rPr>
+              <w:t>Eef</w:t>
+            </w:r>
+            <w:proofErr w:type="spellEnd"/>
           </w:p>
         </w:tc>
       </w:tr>
@@ -2084,7 +2104,71 @@
           <w:rFonts w:ascii="Arial" w:eastAsia="Arial" w:hAnsi="Arial" w:cs="Arial"/>
           <w:color w:val="000000" w:themeColor="text1"/>
         </w:rPr>
-        <w:t>Tyler and Eef have made a start on the Gantt chart (we had to convert it into a libre office type document so that my macbook would be able to actually open it) and I’ve started on the Resource chart. Both charts have alot of cross over with each other, so w</w:t>
+        <w:t xml:space="preserve">Tyler and </w:t>
+      </w:r>
+      <w:proofErr w:type="spellStart"/>
+      <w:r>
+        <w:rPr>
+          <w:rFonts w:ascii="Arial" w:eastAsia="Arial" w:hAnsi="Arial" w:cs="Arial"/>
+          <w:color w:val="000000" w:themeColor="text1"/>
+        </w:rPr>
+        <w:t>Eef</w:t>
+      </w:r>
+      <w:proofErr w:type="spellEnd"/>
+      <w:r>
+        <w:rPr>
+          <w:rFonts w:ascii="Arial" w:eastAsia="Arial" w:hAnsi="Arial" w:cs="Arial"/>
+          <w:color w:val="000000" w:themeColor="text1"/>
+        </w:rPr>
+        <w:t xml:space="preserve"> have made a start on the Gantt chart (we had to convert it into a libre office type document so that my </w:t>
+      </w:r>
+      <w:proofErr w:type="spellStart"/>
+      <w:r>
+        <w:rPr>
+          <w:rFonts w:ascii="Arial" w:eastAsia="Arial" w:hAnsi="Arial" w:cs="Arial"/>
+          <w:color w:val="000000" w:themeColor="text1"/>
+        </w:rPr>
+        <w:t>macbook</w:t>
+      </w:r>
+      <w:proofErr w:type="spellEnd"/>
+      <w:r>
+        <w:rPr>
+          <w:rFonts w:ascii="Arial" w:eastAsia="Arial" w:hAnsi="Arial" w:cs="Arial"/>
+          <w:color w:val="000000" w:themeColor="text1"/>
+        </w:rPr>
+        <w:t xml:space="preserve"> would be able to </w:t>
+      </w:r>
+      <w:proofErr w:type="gramStart"/>
+      <w:r>
+        <w:rPr>
+          <w:rFonts w:ascii="Arial" w:eastAsia="Arial" w:hAnsi="Arial" w:cs="Arial"/>
+          <w:color w:val="000000" w:themeColor="text1"/>
+        </w:rPr>
+        <w:t>actually open</w:t>
+      </w:r>
+      <w:proofErr w:type="gramEnd"/>
+      <w:r>
+        <w:rPr>
+          <w:rFonts w:ascii="Arial" w:eastAsia="Arial" w:hAnsi="Arial" w:cs="Arial"/>
+          <w:color w:val="000000" w:themeColor="text1"/>
+        </w:rPr>
+        <w:t xml:space="preserve"> it) and I’ve started on the Resource chart. Both charts have </w:t>
+      </w:r>
+      <w:proofErr w:type="spellStart"/>
+      <w:r>
+        <w:rPr>
+          <w:rFonts w:ascii="Arial" w:eastAsia="Arial" w:hAnsi="Arial" w:cs="Arial"/>
+          <w:color w:val="000000" w:themeColor="text1"/>
+        </w:rPr>
+        <w:t>alot</w:t>
+      </w:r>
+      <w:proofErr w:type="spellEnd"/>
+      <w:r>
+        <w:rPr>
+          <w:rFonts w:ascii="Arial" w:eastAsia="Arial" w:hAnsi="Arial" w:cs="Arial"/>
+          <w:color w:val="000000" w:themeColor="text1"/>
+        </w:rPr>
+        <w:t xml:space="preserve"> of cross over with each other, so w</w:t>
       </w:r>
       <w:r>
         <w:rPr>
@@ -2141,7 +2225,23 @@
           <w:rFonts w:ascii="Arial" w:eastAsia="Arial" w:hAnsi="Arial" w:cs="Arial"/>
           <w:color w:val="000000" w:themeColor="text1"/>
         </w:rPr>
-        <w:t>In conclusion, we have decided who will more or less be working on each chart, and we will be trying to complete them as quickly as possible with the information we have so far been given.</w:t>
+        <w:t xml:space="preserve">In conclusion, we have decided who will </w:t>
+      </w:r>
+      <w:proofErr w:type="gramStart"/>
+      <w:r>
+        <w:rPr>
+          <w:rFonts w:ascii="Arial" w:eastAsia="Arial" w:hAnsi="Arial" w:cs="Arial"/>
+          <w:color w:val="000000" w:themeColor="text1"/>
+        </w:rPr>
+        <w:t>more or less be</w:t>
+      </w:r>
+      <w:proofErr w:type="gramEnd"/>
+      <w:r>
+        <w:rPr>
+          <w:rFonts w:ascii="Arial" w:eastAsia="Arial" w:hAnsi="Arial" w:cs="Arial"/>
+          <w:color w:val="000000" w:themeColor="text1"/>
+        </w:rPr>
+        <w:t xml:space="preserve"> working on each chart, and we will be trying to complete them as quickly as possible with the information we have so far been given.</w:t>
       </w:r>
       <w:r>
         <w:rPr>
@@ -3140,8 +3240,16 @@
               <w:rPr>
                 <w:rFonts w:ascii="Arial" w:eastAsia="Arial" w:hAnsi="Arial" w:cs="Arial"/>
               </w:rPr>
-              <w:t>Kat, Tyler, Eef</w:t>
-            </w:r>
+              <w:t xml:space="preserve">Kat, Tyler, </w:t>
+            </w:r>
+            <w:proofErr w:type="spellStart"/>
+            <w:r>
+              <w:rPr>
+                <w:rFonts w:ascii="Arial" w:eastAsia="Arial" w:hAnsi="Arial" w:cs="Arial"/>
+              </w:rPr>
+              <w:t>Eef</w:t>
+            </w:r>
+            <w:proofErr w:type="spellEnd"/>
           </w:p>
         </w:tc>
       </w:tr>
@@ -3502,6 +3610,40 @@
         </w:rPr>
         <w:t xml:space="preserve">Kat: </w:t>
       </w:r>
+      <w:r>
+        <w:rPr>
+          <w:rFonts w:ascii="Arial" w:eastAsia="Arial" w:hAnsi="Arial" w:cs="Arial"/>
+          <w:color w:val="000000" w:themeColor="text1"/>
+        </w:rPr>
+        <w:t>For my contributions to iteration 2 of this project, I oversaw setting up the Kanban for our group and creating the resource list.</w:t>
+      </w:r>
+    </w:p>
+    <w:p>
+      <w:pPr>
+        <w:keepNext/>
+        <w:spacing w:before="200" w:after="120"/>
+        <w:rPr>
+          <w:rFonts w:ascii="Arial" w:eastAsia="Arial" w:hAnsi="Arial" w:cs="Arial"/>
+          <w:color w:val="000000" w:themeColor="text1"/>
+        </w:rPr>
+      </w:pPr>
+      <w:r>
+        <w:rPr>
+          <w:rFonts w:ascii="Arial" w:eastAsia="Arial" w:hAnsi="Arial" w:cs="Arial"/>
+          <w:color w:val="000000" w:themeColor="text1"/>
+        </w:rPr>
+        <w:t>I believe that our team could be better at handing out tasks as well as communicating what step we are in for each task and how long we believe the task is going to take.</w:t>
+      </w:r>
+    </w:p>
+    <w:p>
+      <w:pPr>
+        <w:keepNext/>
+        <w:spacing w:before="200" w:after="120"/>
+        <w:rPr>
+          <w:rFonts w:ascii="Arial" w:eastAsia="Arial" w:hAnsi="Arial" w:cs="Arial"/>
+          <w:color w:val="000000" w:themeColor="text1"/>
+        </w:rPr>
+      </w:pPr>
     </w:p>
     <w:p>
       <w:pPr>
@@ -3784,8 +3926,18 @@
           <w:sz w:val="24"/>
           <w:szCs w:val="24"/>
         </w:rPr>
-        <w:t>he use of git</w:t>
-      </w:r>
+        <w:t xml:space="preserve">he use of </w:t>
+      </w:r>
+      <w:proofErr w:type="gramStart"/>
+      <w:r>
+        <w:rPr>
+          <w:rFonts w:ascii="Abadi" w:eastAsia="Abadi" w:hAnsi="Abadi" w:cs="Abadi"/>
+          <w:sz w:val="24"/>
+          <w:szCs w:val="24"/>
+        </w:rPr>
+        <w:t>git</w:t>
+      </w:r>
+      <w:proofErr w:type="gramEnd"/>
       <w:r>
         <w:rPr>
           <w:rFonts w:ascii="Abadi" w:eastAsia="Abadi" w:hAnsi="Abadi" w:cs="Abadi"/>
@@ -3957,7 +4109,6 @@
         <w:docPartUnique/>
       </w:docPartObj>
     </w:sdtPr>
-    <w:sdtEndPr/>
     <w:sdtContent>
       <w:sdt>
         <w:sdtPr>
@@ -3967,7 +4118,6 @@
             <w:docPartUnique/>
           </w:docPartObj>
         </w:sdtPr>
-        <w:sdtEndPr/>
         <w:sdtContent>
           <w:p>
             <w:pPr>
@@ -6393,9 +6543,11 @@
     <w:rsid w:val="005B44B8"/>
     <w:rsid w:val="00637C99"/>
     <w:rsid w:val="00680CB4"/>
+    <w:rsid w:val="00771B8A"/>
     <w:rsid w:val="007A667F"/>
     <w:rsid w:val="008749FB"/>
     <w:rsid w:val="008B5F10"/>
+    <w:rsid w:val="008E72ED"/>
     <w:rsid w:val="00907F6B"/>
     <w:rsid w:val="0098480A"/>
     <w:rsid w:val="009A32F5"/>
@@ -7193,6 +7345,21 @@
 </file>
 
 <file path=customXml/item1.xml><?xml version="1.0" encoding="utf-8"?>
+<p:properties xmlns:p="http://schemas.microsoft.com/office/2006/metadata/properties" xmlns:xsi="http://www.w3.org/2001/XMLSchema-instance" xmlns:pc="http://schemas.microsoft.com/office/infopath/2007/PartnerControls">
+  <documentManagement/>
+</p:properties>
+</file>
+
+<file path=customXml/item2.xml><?xml version="1.0" encoding="utf-8"?>
+<?mso-contentType ?>
+<FormTemplates xmlns="http://schemas.microsoft.com/sharepoint/v3/contenttype/forms">
+  <Display>DocumentLibraryForm</Display>
+  <Edit>DocumentLibraryForm</Edit>
+  <New>DocumentLibraryForm</New>
+</FormTemplates>
+</file>
+
+<file path=customXml/item3.xml><?xml version="1.0" encoding="utf-8"?>
 <ct:contentTypeSchema xmlns:ct="http://schemas.microsoft.com/office/2006/metadata/contentType" xmlns:ma="http://schemas.microsoft.com/office/2006/metadata/properties/metaAttributes" ct:_="" ma:_="" ma:contentTypeName="Document" ma:contentTypeID="0x01010021FF3BF40CCD11489C7593694C95B5EE" ma:contentTypeVersion="5" ma:contentTypeDescription="Create a new document." ma:contentTypeScope="" ma:versionID="0f55d8ddadf25351cdb08e8e82fe1ea8">
   <xsd:schema xmlns:xsd="http://www.w3.org/2001/XMLSchema" xmlns:xs="http://www.w3.org/2001/XMLSchema" xmlns:p="http://schemas.microsoft.com/office/2006/metadata/properties" xmlns:ns3="2f0470b4-47c5-4c14-ad46-72f8b378acfd" xmlns:ns4="3032a5e3-5993-49f6-b730-086e11975eaf" targetNamespace="http://schemas.microsoft.com/office/2006/metadata/properties" ma:root="true" ma:fieldsID="0781f59e628f971fb4ef0c186e6a0de8" ns3:_="" ns4:_="">
     <xsd:import namespace="2f0470b4-47c5-4c14-ad46-72f8b378acfd"/>
@@ -7363,22 +7530,24 @@
 </ct:contentTypeSchema>
 </file>
 
-<file path=customXml/item2.xml><?xml version="1.0" encoding="utf-8"?>
-<?mso-contentType ?>
-<FormTemplates xmlns="http://schemas.microsoft.com/sharepoint/v3/contenttype/forms">
-  <Display>DocumentLibraryForm</Display>
-  <Edit>DocumentLibraryForm</Edit>
-  <New>DocumentLibraryForm</New>
-</FormTemplates>
+<file path=customXml/itemProps1.xml><?xml version="1.0" encoding="utf-8"?>
+<ds:datastoreItem xmlns:ds="http://schemas.openxmlformats.org/officeDocument/2006/customXml" ds:itemID="{5A86B5EA-CD6A-44AC-ADB2-4CA45AFB352E}">
+  <ds:schemaRefs>
+    <ds:schemaRef ds:uri="http://schemas.microsoft.com/office/2006/metadata/properties"/>
+    <ds:schemaRef ds:uri="http://schemas.microsoft.com/office/infopath/2007/PartnerControls"/>
+  </ds:schemaRefs>
+</ds:datastoreItem>
 </file>
 
-<file path=customXml/item3.xml><?xml version="1.0" encoding="utf-8"?>
-<p:properties xmlns:p="http://schemas.microsoft.com/office/2006/metadata/properties" xmlns:xsi="http://www.w3.org/2001/XMLSchema-instance" xmlns:pc="http://schemas.microsoft.com/office/infopath/2007/PartnerControls">
-  <documentManagement/>
-</p:properties>
+<file path=customXml/itemProps2.xml><?xml version="1.0" encoding="utf-8"?>
+<ds:datastoreItem xmlns:ds="http://schemas.openxmlformats.org/officeDocument/2006/customXml" ds:itemID="{5542552F-FBC5-443F-B977-388D14297FB7}">
+  <ds:schemaRefs>
+    <ds:schemaRef ds:uri="http://schemas.microsoft.com/sharepoint/v3/contenttype/forms"/>
+  </ds:schemaRefs>
+</ds:datastoreItem>
 </file>
 
-<file path=customXml/itemProps1.xml><?xml version="1.0" encoding="utf-8"?>
+<file path=customXml/itemProps3.xml><?xml version="1.0" encoding="utf-8"?>
 <ds:datastoreItem xmlns:ds="http://schemas.openxmlformats.org/officeDocument/2006/customXml" ds:itemID="{C19EFC77-5989-4EDB-B85D-0DAD07F34557}">
   <ds:schemaRefs>
     <ds:schemaRef ds:uri="http://schemas.microsoft.com/office/2006/metadata/contentType"/>
@@ -7395,21 +7564,4 @@
     <ds:schemaRef ds:uri="http://schemas.microsoft.com/internal/obd"/>
   </ds:schemaRefs>
 </ds:datastoreItem>
-</file>
-
-<file path=customXml/itemProps2.xml><?xml version="1.0" encoding="utf-8"?>
-<ds:datastoreItem xmlns:ds="http://schemas.openxmlformats.org/officeDocument/2006/customXml" ds:itemID="{5542552F-FBC5-443F-B977-388D14297FB7}">
-  <ds:schemaRefs>
-    <ds:schemaRef ds:uri="http://schemas.microsoft.com/sharepoint/v3/contenttype/forms"/>
-  </ds:schemaRefs>
-</ds:datastoreItem>
-</file>
-
-<file path=customXml/itemProps3.xml><?xml version="1.0" encoding="utf-8"?>
-<ds:datastoreItem xmlns:ds="http://schemas.openxmlformats.org/officeDocument/2006/customXml" ds:itemID="{5A86B5EA-CD6A-44AC-ADB2-4CA45AFB352E}">
-  <ds:schemaRefs>
-    <ds:schemaRef ds:uri="http://schemas.microsoft.com/office/2006/metadata/properties"/>
-    <ds:schemaRef ds:uri="http://schemas.microsoft.com/office/infopath/2007/PartnerControls"/>
-  </ds:schemaRefs>
-</ds:datastoreItem>
 </file>
</xml_diff>